<commit_message>
fix leave request and profile
</commit_message>
<xml_diff>
--- a/public/templates/Leave_Form_Admin.docx
+++ b/public/templates/Leave_Form_Admin.docx
@@ -367,7 +367,7 @@
           <w:noProof/>
         </w:rPr>
         <w:drawing>
-          <wp:anchor distT="0" distB="0" distL="114300" distR="114300" simplePos="0" relativeHeight="251739136" behindDoc="0" locked="0" layoutInCell="1" allowOverlap="1" wp14:anchorId="4D25A649" wp14:editId="03105B60">
+          <wp:anchor distT="0" distB="0" distL="114300" distR="114300" simplePos="0" relativeHeight="251739136" behindDoc="0" locked="0" layoutInCell="1" allowOverlap="1" wp14:anchorId="4D25A649" wp14:editId="1942BC8A">
             <wp:simplePos x="0" y="0"/>
             <wp:positionH relativeFrom="column">
               <wp:posOffset>97155</wp:posOffset>
@@ -548,25 +548,7 @@
           <w:sz w:val="20"/>
           <w:lang w:val="en-US"/>
         </w:rPr>
-        <w:t>Albay-</w:t>
-      </w:r>
-      <w:proofErr w:type="spellStart"/>
-      <w:r>
-        <w:rPr>
-          <w:rFonts w:ascii="Trajan Pro" w:hAnsi="Trajan Pro"/>
-          <w:sz w:val="20"/>
-          <w:lang w:val="en-US"/>
-        </w:rPr>
-        <w:t>Catanduanes</w:t>
-      </w:r>
-      <w:proofErr w:type="spellEnd"/>
-      <w:r>
-        <w:rPr>
-          <w:rFonts w:ascii="Trajan Pro" w:hAnsi="Trajan Pro"/>
-          <w:sz w:val="20"/>
-          <w:lang w:val="en-US"/>
-        </w:rPr>
-        <w:t xml:space="preserve"> Irrigation Management Office</w:t>
+        <w:t>Albay-Catanduanes Irrigation Management Office</w:t>
       </w:r>
     </w:p>
     <w:p>
@@ -580,41 +562,13 @@
           <w:lang w:val="en-US"/>
         </w:rPr>
       </w:pPr>
-      <w:proofErr w:type="spellStart"/>
       <w:r>
         <w:rPr>
           <w:rFonts w:ascii="Trajan Pro" w:hAnsi="Trajan Pro"/>
           <w:sz w:val="20"/>
           <w:lang w:val="en-US"/>
         </w:rPr>
-        <w:t>Tuburan</w:t>
-      </w:r>
-      <w:proofErr w:type="spellEnd"/>
-      <w:r>
-        <w:rPr>
-          <w:rFonts w:ascii="Trajan Pro" w:hAnsi="Trajan Pro"/>
-          <w:sz w:val="20"/>
-          <w:lang w:val="en-US"/>
-        </w:rPr>
-        <w:t xml:space="preserve">, </w:t>
-      </w:r>
-      <w:proofErr w:type="spellStart"/>
-      <w:r>
-        <w:rPr>
-          <w:rFonts w:ascii="Trajan Pro" w:hAnsi="Trajan Pro"/>
-          <w:sz w:val="20"/>
-          <w:lang w:val="en-US"/>
-        </w:rPr>
-        <w:t>Ligao</w:t>
-      </w:r>
-      <w:proofErr w:type="spellEnd"/>
-      <w:r>
-        <w:rPr>
-          <w:rFonts w:ascii="Trajan Pro" w:hAnsi="Trajan Pro"/>
-          <w:sz w:val="20"/>
-          <w:lang w:val="en-US"/>
-        </w:rPr>
-        <w:t xml:space="preserve"> City, Albay</w:t>
+        <w:t>Tuburan, Ligao City, Albay</w:t>
       </w:r>
     </w:p>
     <w:p>
@@ -969,9 +923,8 @@
                 <w:szCs w:val="20"/>
                 <w:lang w:val="en-US"/>
               </w:rPr>
-              <w:t xml:space="preserve">  </w:t>
+              <w:t xml:space="preserve">     (First)</w:t>
             </w:r>
-            <w:proofErr w:type="gramStart"/>
             <w:r>
               <w:rPr>
                 <w:rFonts w:ascii="Arial" w:hAnsi="Arial" w:cs="Arial"/>
@@ -979,9 +932,9 @@
                 <w:szCs w:val="20"/>
                 <w:lang w:val="en-US"/>
               </w:rPr>
-              <w:t xml:space="preserve">   (</w:t>
+              <w:tab/>
+              <w:t xml:space="preserve">        </w:t>
             </w:r>
-            <w:proofErr w:type="gramEnd"/>
             <w:r>
               <w:rPr>
                 <w:rFonts w:ascii="Arial" w:hAnsi="Arial" w:cs="Arial"/>
@@ -989,46 +942,7 @@
                 <w:szCs w:val="20"/>
                 <w:lang w:val="en-US"/>
               </w:rPr>
-              <w:t>First)</w:t>
-            </w:r>
-            <w:r>
-              <w:rPr>
-                <w:rFonts w:ascii="Arial" w:hAnsi="Arial" w:cs="Arial"/>
-                <w:sz w:val="20"/>
-                <w:szCs w:val="20"/>
-                <w:lang w:val="en-US"/>
-              </w:rPr>
-              <w:tab/>
-              <w:t xml:space="preserve">     </w:t>
-            </w:r>
-            <w:proofErr w:type="gramStart"/>
-            <w:r>
-              <w:rPr>
-                <w:rFonts w:ascii="Arial" w:hAnsi="Arial" w:cs="Arial"/>
-                <w:sz w:val="20"/>
-                <w:szCs w:val="20"/>
-                <w:lang w:val="en-US"/>
-              </w:rPr>
-              <w:t xml:space="preserve">   </w:t>
-            </w:r>
-            <w:r>
-              <w:rPr>
-                <w:rFonts w:ascii="Arial" w:hAnsi="Arial" w:cs="Arial"/>
-                <w:sz w:val="20"/>
-                <w:szCs w:val="20"/>
-                <w:lang w:val="en-US"/>
-              </w:rPr>
-              <w:t>(</w:t>
-            </w:r>
-            <w:proofErr w:type="gramEnd"/>
-            <w:r>
-              <w:rPr>
-                <w:rFonts w:ascii="Arial" w:hAnsi="Arial" w:cs="Arial"/>
-                <w:sz w:val="20"/>
-                <w:szCs w:val="20"/>
-                <w:lang w:val="en-US"/>
-              </w:rPr>
-              <w:t>Middle)</w:t>
+              <w:t>(Middle)</w:t>
             </w:r>
           </w:p>
           <w:p>
@@ -1497,7 +1411,6 @@
                 <w:lang w:val="en-US"/>
               </w:rPr>
             </w:pPr>
-            <w:proofErr w:type="gramStart"/>
             <w:r>
               <w:rPr>
                 <w:rFonts w:ascii="Arial" w:hAnsi="Arial" w:cs="Arial"/>
@@ -1506,18 +1419,7 @@
                 <w:szCs w:val="20"/>
                 <w:lang w:val="en-US"/>
               </w:rPr>
-              <w:t>6.A  TYPE</w:t>
-            </w:r>
-            <w:proofErr w:type="gramEnd"/>
-            <w:r>
-              <w:rPr>
-                <w:rFonts w:ascii="Arial" w:hAnsi="Arial" w:cs="Arial"/>
-                <w:i/>
-                <w:sz w:val="20"/>
-                <w:szCs w:val="20"/>
-                <w:lang w:val="en-US"/>
-              </w:rPr>
-              <w:t xml:space="preserve"> OF LEAVE TO BE AVAILED OF</w:t>
+              <w:t>6.A  TYPE OF LEAVE TO BE AVAILED OF</w:t>
             </w:r>
           </w:p>
         </w:tc>
@@ -1789,7 +1691,7 @@
                 </mc:Choice>
                 <mc:Fallback>
                   <w:pict>
-                    <v:shape w14:anchorId="7E4AD62C" id="_x0000_s1033" type="#_x0000_t202" style="position:absolute;margin-left:105.5pt;margin-top:14.55pt;width:96.75pt;height:22.5pt;z-index:251680768;visibility:visible;mso-wrap-style:square;mso-width-percent:0;mso-height-percent:0;mso-wrap-distance-left:9pt;mso-wrap-distance-top:3.6pt;mso-wrap-distance-right:9pt;mso-wrap-distance-bottom:3.6pt;mso-position-horizontal:absolute;mso-position-horizontal-relative:text;mso-position-vertical:absolute;mso-position-vertical-relative:text;mso-width-percent:0;mso-height-percent:0;mso-width-relative:margin;mso-height-relative:margin;v-text-anchor:top" o:gfxdata="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" filled="f" stroked="f">
+                    <v:shape w14:anchorId="7E4AD62C" id="_x0000_s1031" type="#_x0000_t202" style="position:absolute;margin-left:105.5pt;margin-top:14.55pt;width:96.75pt;height:22.5pt;z-index:251680768;visibility:visible;mso-wrap-style:square;mso-width-percent:0;mso-height-percent:0;mso-wrap-distance-left:9pt;mso-wrap-distance-top:3.6pt;mso-wrap-distance-right:9pt;mso-wrap-distance-bottom:3.6pt;mso-position-horizontal:absolute;mso-position-horizontal-relative:text;mso-position-vertical:absolute;mso-position-vertical-relative:text;mso-width-percent:0;mso-height-percent:0;mso-width-relative:margin;mso-height-relative:margin;v-text-anchor:top" o:gfxdata="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" filled="f" stroked="f">
                       <v:textbox inset="0,0,0,0">
                         <w:txbxContent>
                           <w:p>
@@ -2294,7 +2196,6 @@
                 <w:lang w:val="en-US"/>
               </w:rPr>
             </w:pPr>
-            <w:proofErr w:type="gramStart"/>
             <w:r>
               <w:rPr>
                 <w:rFonts w:ascii="Arial" w:hAnsi="Arial" w:cs="Arial"/>
@@ -2302,17 +2203,7 @@
                 <w:szCs w:val="20"/>
                 <w:lang w:val="en-US"/>
               </w:rPr>
-              <w:t>Abroad  _</w:t>
-            </w:r>
-            <w:proofErr w:type="gramEnd"/>
-            <w:r>
-              <w:rPr>
-                <w:rFonts w:ascii="Arial" w:hAnsi="Arial" w:cs="Arial"/>
-                <w:sz w:val="16"/>
-                <w:szCs w:val="20"/>
-                <w:lang w:val="en-US"/>
-              </w:rPr>
-              <w:t>_____________________________</w:t>
+              <w:t>Abroad  ______________________________</w:t>
             </w:r>
           </w:p>
         </w:tc>
@@ -2550,7 +2441,7 @@
                 </mc:Choice>
                 <mc:Fallback>
                   <w:pict>
-                    <v:shape w14:anchorId="6C150619" id="_x0000_s1034" type="#_x0000_t202" style="position:absolute;margin-left:141.05pt;margin-top:10.35pt;width:69.75pt;height:15pt;z-index:251684864;visibility:visible;mso-wrap-style:square;mso-width-percent:0;mso-height-percent:0;mso-wrap-distance-left:9pt;mso-wrap-distance-top:3.6pt;mso-wrap-distance-right:9pt;mso-wrap-distance-bottom:3.6pt;mso-position-horizontal:absolute;mso-position-horizontal-relative:text;mso-position-vertical:absolute;mso-position-vertical-relative:page;mso-width-percent:0;mso-height-percent:0;mso-width-relative:margin;mso-height-relative:margin;v-text-anchor:top" o:gfxdata="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" filled="f" stroked="f">
+                    <v:shape w14:anchorId="6C150619" id="_x0000_s1032" type="#_x0000_t202" style="position:absolute;margin-left:141.05pt;margin-top:10.35pt;width:69.75pt;height:15pt;z-index:251684864;visibility:visible;mso-wrap-style:square;mso-width-percent:0;mso-height-percent:0;mso-wrap-distance-left:9pt;mso-wrap-distance-top:3.6pt;mso-wrap-distance-right:9pt;mso-wrap-distance-bottom:3.6pt;mso-position-horizontal:absolute;mso-position-horizontal-relative:text;mso-position-vertical:absolute;mso-position-vertical-relative:page;mso-width-percent:0;mso-height-percent:0;mso-width-relative:margin;mso-height-relative:margin;v-text-anchor:top" o:gfxdata="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" filled="f" stroked="f">
                       <v:textbox inset="0,0,0,0">
                         <w:txbxContent>
                           <w:p>
@@ -2665,7 +2556,7 @@
                 </mc:Choice>
                 <mc:Fallback>
                   <w:pict>
-                    <v:shape w14:anchorId="4429ECB9" id="_x0000_s1035" type="#_x0000_t202" style="position:absolute;margin-left:71.45pt;margin-top:-16.8pt;width:132.75pt;height:25.5pt;z-index:251682816;visibility:visible;mso-wrap-style:square;mso-width-percent:0;mso-height-percent:0;mso-wrap-distance-left:9pt;mso-wrap-distance-top:3.6pt;mso-wrap-distance-right:9pt;mso-wrap-distance-bottom:3.6pt;mso-position-horizontal:absolute;mso-position-horizontal-relative:text;mso-position-vertical:absolute;mso-position-vertical-relative:page;mso-width-percent:0;mso-height-percent:0;mso-width-relative:margin;mso-height-relative:margin;v-text-anchor:top" o:gfxdata="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" filled="f" stroked="f">
+                    <v:shape w14:anchorId="4429ECB9" id="_x0000_s1033" type="#_x0000_t202" style="position:absolute;margin-left:71.45pt;margin-top:-16.8pt;width:132.75pt;height:25.5pt;z-index:251682816;visibility:visible;mso-wrap-style:square;mso-width-percent:0;mso-height-percent:0;mso-wrap-distance-left:9pt;mso-wrap-distance-top:3.6pt;mso-wrap-distance-right:9pt;mso-wrap-distance-bottom:3.6pt;mso-position-horizontal:absolute;mso-position-horizontal-relative:text;mso-position-vertical:absolute;mso-position-vertical-relative:page;mso-width-percent:0;mso-height-percent:0;mso-width-relative:margin;mso-height-relative:margin;v-text-anchor:top" o:gfxdata="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" filled="f" stroked="f">
                       <v:textbox inset="0,0,0,0">
                         <w:txbxContent>
                           <w:p>
@@ -3448,7 +3339,7 @@
                 </mc:Choice>
                 <mc:Fallback>
                   <w:pict>
-                    <v:shape w14:anchorId="0B87C83E" id="_x0000_s1036" type="#_x0000_t202" style="position:absolute;margin-left:147.8pt;margin-top:-16.8pt;width:51.75pt;height:18.75pt;z-index:251686912;visibility:visible;mso-wrap-style:square;mso-width-percent:0;mso-height-percent:0;mso-wrap-distance-left:9pt;mso-wrap-distance-top:3.6pt;mso-wrap-distance-right:9pt;mso-wrap-distance-bottom:3.6pt;mso-position-horizontal:absolute;mso-position-horizontal-relative:text;mso-position-vertical:absolute;mso-position-vertical-relative:page;mso-width-percent:0;mso-height-percent:0;mso-width-relative:margin;mso-height-relative:margin;v-text-anchor:top" o:gfxdata="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" filled="f" stroked="f">
+                    <v:shape w14:anchorId="0B87C83E" id="_x0000_s1034" type="#_x0000_t202" style="position:absolute;margin-left:147.8pt;margin-top:-16.8pt;width:51.75pt;height:18.75pt;z-index:251686912;visibility:visible;mso-wrap-style:square;mso-width-percent:0;mso-height-percent:0;mso-wrap-distance-left:9pt;mso-wrap-distance-top:3.6pt;mso-wrap-distance-right:9pt;mso-wrap-distance-bottom:3.6pt;mso-position-horizontal:absolute;mso-position-horizontal-relative:text;mso-position-vertical:absolute;mso-position-vertical-relative:page;mso-width-percent:0;mso-height-percent:0;mso-width-relative:margin;mso-height-relative:margin;v-text-anchor:top" o:gfxdata="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" filled="f" stroked="f">
                       <v:textbox inset="0,0,0,0">
                         <w:txbxContent>
                           <w:p>
@@ -3550,7 +3441,7 @@
                 </mc:Choice>
                 <mc:Fallback>
                   <w:pict>
-                    <v:shape w14:anchorId="383074A0" id="_x0000_s1037" type="#_x0000_t202" style="position:absolute;margin-left:.1pt;margin-top:-3pt;width:198.75pt;height:19.5pt;z-index:251688960;visibility:visible;mso-wrap-style:square;mso-width-percent:0;mso-height-percent:0;mso-wrap-distance-left:9pt;mso-wrap-distance-top:3.6pt;mso-wrap-distance-right:9pt;mso-wrap-distance-bottom:3.6pt;mso-position-horizontal:absolute;mso-position-horizontal-relative:text;mso-position-vertical:absolute;mso-position-vertical-relative:page;mso-width-percent:0;mso-height-percent:0;mso-width-relative:margin;mso-height-relative:margin;v-text-anchor:top" o:gfxdata="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" filled="f" stroked="f">
+                    <v:shape w14:anchorId="383074A0" id="_x0000_s1035" type="#_x0000_t202" style="position:absolute;margin-left:.1pt;margin-top:-3pt;width:198.75pt;height:19.5pt;z-index:251688960;visibility:visible;mso-wrap-style:square;mso-width-percent:0;mso-height-percent:0;mso-wrap-distance-left:9pt;mso-wrap-distance-top:3.6pt;mso-wrap-distance-right:9pt;mso-wrap-distance-bottom:3.6pt;mso-position-horizontal:absolute;mso-position-horizontal-relative:text;mso-position-vertical:absolute;mso-position-vertical-relative:page;mso-width-percent:0;mso-height-percent:0;mso-width-relative:margin;mso-height-relative:margin;v-text-anchor:top" o:gfxdata="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" filled="f" stroked="f">
                       <v:textbox inset="0,0,0,0">
                         <w:txbxContent>
                           <w:p>
@@ -3818,7 +3709,7 @@
                 </mc:Choice>
                 <mc:Fallback>
                   <w:pict>
-                    <v:shape w14:anchorId="5B12B8C0" id="_x0000_s1038" type="#_x0000_t202" style="position:absolute;margin-left:6.9pt;margin-top:12.8pt;width:198.75pt;height:16.5pt;z-index:251691008;visibility:visible;mso-wrap-style:square;mso-width-percent:0;mso-height-percent:0;mso-wrap-distance-left:9pt;mso-wrap-distance-top:3.6pt;mso-wrap-distance-right:9pt;mso-wrap-distance-bottom:3.6pt;mso-position-horizontal:absolute;mso-position-horizontal-relative:text;mso-position-vertical:absolute;mso-position-vertical-relative:page;mso-width-percent:0;mso-height-percent:0;mso-width-relative:margin;mso-height-relative:margin;v-text-anchor:top" o:gfxdata="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" filled="f" stroked="f">
+                    <v:shape w14:anchorId="5B12B8C0" id="_x0000_s1036" type="#_x0000_t202" style="position:absolute;margin-left:6.9pt;margin-top:12.8pt;width:198.75pt;height:16.5pt;z-index:251691008;visibility:visible;mso-wrap-style:square;mso-width-percent:0;mso-height-percent:0;mso-wrap-distance-left:9pt;mso-wrap-distance-top:3.6pt;mso-wrap-distance-right:9pt;mso-wrap-distance-bottom:3.6pt;mso-position-horizontal:absolute;mso-position-horizontal-relative:text;mso-position-vertical:absolute;mso-position-vertical-relative:page;mso-width-percent:0;mso-height-percent:0;mso-width-relative:margin;mso-height-relative:margin;v-text-anchor:top" o:gfxdata="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" filled="f" stroked="f">
                       <v:textbox inset="0,0,0,0">
                         <w:txbxContent>
                           <w:p>
@@ -5284,7 +5175,6 @@
                 <w:lang w:val="en-US"/>
               </w:rPr>
             </w:pPr>
-            <w:proofErr w:type="gramStart"/>
             <w:r>
               <w:rPr>
                 <w:rFonts w:ascii="Arial" w:hAnsi="Arial" w:cs="Arial"/>
@@ -5293,18 +5183,7 @@
                 <w:szCs w:val="20"/>
                 <w:lang w:val="en-US"/>
               </w:rPr>
-              <w:t>6.C  NUMBER</w:t>
-            </w:r>
-            <w:proofErr w:type="gramEnd"/>
-            <w:r>
-              <w:rPr>
-                <w:rFonts w:ascii="Arial" w:hAnsi="Arial" w:cs="Arial"/>
-                <w:i/>
-                <w:sz w:val="20"/>
-                <w:szCs w:val="20"/>
-                <w:lang w:val="en-US"/>
-              </w:rPr>
-              <w:t xml:space="preserve"> OF WORKING DAYS APPLIED FOR</w:t>
+              <w:t>6.C  NUMBER OF WORKING DAYS APPLIED FOR</w:t>
             </w:r>
           </w:p>
           <w:p>
@@ -5397,7 +5276,7 @@
                 </mc:Choice>
                 <mc:Fallback>
                   <w:pict>
-                    <v:shape w14:anchorId="454C4C29" id="_x0000_s1039" type="#_x0000_t202" style="position:absolute;margin-left:122.5pt;margin-top:4.55pt;width:159pt;height:21pt;z-index:251710464;visibility:visible;mso-wrap-style:square;mso-width-percent:0;mso-height-percent:0;mso-wrap-distance-left:9pt;mso-wrap-distance-top:3.6pt;mso-wrap-distance-right:9pt;mso-wrap-distance-bottom:3.6pt;mso-position-horizontal:absolute;mso-position-horizontal-relative:text;mso-position-vertical:absolute;mso-position-vertical-relative:text;mso-width-percent:0;mso-height-percent:0;mso-width-relative:margin;mso-height-relative:margin;v-text-anchor:top" o:gfxdata="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" filled="f" stroked="f">
+                    <v:shape w14:anchorId="454C4C29" id="_x0000_s1037" type="#_x0000_t202" style="position:absolute;margin-left:122.5pt;margin-top:4.55pt;width:159pt;height:21pt;z-index:251710464;visibility:visible;mso-wrap-style:square;mso-width-percent:0;mso-height-percent:0;mso-wrap-distance-left:9pt;mso-wrap-distance-top:3.6pt;mso-wrap-distance-right:9pt;mso-wrap-distance-bottom:3.6pt;mso-position-horizontal:absolute;mso-position-horizontal-relative:text;mso-position-vertical:absolute;mso-position-vertical-relative:text;mso-width-percent:0;mso-height-percent:0;mso-width-relative:margin;mso-height-relative:margin;v-text-anchor:top" o:gfxdata="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" filled="f" stroked="f">
                       <v:textbox inset="0,0,0,0">
                         <w:txbxContent>
                           <w:p>
@@ -5645,7 +5524,7 @@
                 </mc:Choice>
                 <mc:Fallback>
                   <w:pict>
-                    <v:shape w14:anchorId="0D1CFDAA" id="_x0000_s1040" type="#_x0000_t202" style="position:absolute;margin-left:120.85pt;margin-top:11.2pt;width:159pt;height:21pt;z-index:251711488;visibility:visible;mso-wrap-style:square;mso-width-percent:0;mso-height-percent:0;mso-wrap-distance-left:9pt;mso-wrap-distance-top:3.6pt;mso-wrap-distance-right:9pt;mso-wrap-distance-bottom:3.6pt;mso-position-horizontal:absolute;mso-position-horizontal-relative:text;mso-position-vertical:absolute;mso-position-vertical-relative:text;mso-width-percent:0;mso-height-percent:0;mso-width-relative:margin;mso-height-relative:margin;v-text-anchor:top" o:gfxdata="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" filled="f" stroked="f">
+                    <v:shape w14:anchorId="0D1CFDAA" id="_x0000_s1038" type="#_x0000_t202" style="position:absolute;margin-left:120.85pt;margin-top:11.2pt;width:159pt;height:21pt;z-index:251711488;visibility:visible;mso-wrap-style:square;mso-width-percent:0;mso-height-percent:0;mso-wrap-distance-left:9pt;mso-wrap-distance-top:3.6pt;mso-wrap-distance-right:9pt;mso-wrap-distance-bottom:3.6pt;mso-position-horizontal:absolute;mso-position-horizontal-relative:text;mso-position-vertical:absolute;mso-position-vertical-relative:text;mso-width-percent:0;mso-height-percent:0;mso-width-relative:margin;mso-height-relative:margin;v-text-anchor:top" o:gfxdata="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" filled="f" stroked="f">
                       <v:textbox inset="0,0,0,0">
                         <w:txbxContent>
                           <w:p>
@@ -5808,7 +5687,6 @@
                 <w:lang w:val="en-US"/>
               </w:rPr>
             </w:pPr>
-            <w:proofErr w:type="gramStart"/>
             <w:r>
               <w:rPr>
                 <w:rFonts w:ascii="Arial" w:hAnsi="Arial" w:cs="Arial"/>
@@ -5819,7 +5697,6 @@
               </w:rPr>
               <w:t>6.D  COMMUTATION</w:t>
             </w:r>
-            <w:proofErr w:type="gramEnd"/>
           </w:p>
         </w:tc>
       </w:tr>
@@ -6272,7 +6149,6 @@
                 <w:lang w:val="en-US"/>
               </w:rPr>
             </w:pPr>
-            <w:proofErr w:type="gramStart"/>
             <w:r>
               <w:rPr>
                 <w:rFonts w:ascii="Arial" w:hAnsi="Arial" w:cs="Arial"/>
@@ -6281,18 +6157,7 @@
                 <w:szCs w:val="20"/>
                 <w:lang w:val="en-US"/>
               </w:rPr>
-              <w:t>7.A  CERTIFICATION</w:t>
-            </w:r>
-            <w:proofErr w:type="gramEnd"/>
-            <w:r>
-              <w:rPr>
-                <w:rFonts w:ascii="Arial" w:hAnsi="Arial" w:cs="Arial"/>
-                <w:i/>
-                <w:sz w:val="20"/>
-                <w:szCs w:val="20"/>
-                <w:lang w:val="en-US"/>
-              </w:rPr>
-              <w:t xml:space="preserve"> OF LEAVE CREDITS</w:t>
+              <w:t>7.A  CERTIFICATION OF LEAVE CREDITS</w:t>
             </w:r>
           </w:p>
         </w:tc>
@@ -6319,7 +6184,6 @@
                 <w:lang w:val="en-US"/>
               </w:rPr>
             </w:pPr>
-            <w:proofErr w:type="gramStart"/>
             <w:r>
               <w:rPr>
                 <w:rFonts w:ascii="Arial" w:hAnsi="Arial" w:cs="Arial"/>
@@ -6330,7 +6194,6 @@
               </w:rPr>
               <w:t>7.B  RECOMMENDATION</w:t>
             </w:r>
-            <w:proofErr w:type="gramEnd"/>
           </w:p>
         </w:tc>
       </w:tr>
@@ -7419,7 +7282,7 @@
                 </mc:Choice>
                 <mc:Fallback>
                   <w:pict>
-                    <v:shape w14:anchorId="56C97410" id="_x0000_s1041" type="#_x0000_t202" style="position:absolute;left:0;text-align:left;margin-left:17.1pt;margin-top:10.35pt;width:260.25pt;height:31.5pt;z-index:251718656;visibility:visible;mso-wrap-style:square;mso-width-percent:0;mso-height-percent:0;mso-wrap-distance-left:9pt;mso-wrap-distance-top:3.6pt;mso-wrap-distance-right:9pt;mso-wrap-distance-bottom:3.6pt;mso-position-horizontal:absolute;mso-position-horizontal-relative:text;mso-position-vertical:absolute;mso-position-vertical-relative:text;mso-width-percent:0;mso-height-percent:0;mso-width-relative:margin;mso-height-relative:margin;v-text-anchor:top" o:gfxdata="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" filled="f" stroked="f">
+                    <v:shape w14:anchorId="56C97410" id="_x0000_s1039" type="#_x0000_t202" style="position:absolute;left:0;text-align:left;margin-left:17.1pt;margin-top:10.35pt;width:260.25pt;height:31.5pt;z-index:251718656;visibility:visible;mso-wrap-style:square;mso-width-percent:0;mso-height-percent:0;mso-wrap-distance-left:9pt;mso-wrap-distance-top:3.6pt;mso-wrap-distance-right:9pt;mso-wrap-distance-bottom:3.6pt;mso-position-horizontal:absolute;mso-position-horizontal-relative:text;mso-position-vertical:absolute;mso-position-vertical-relative:text;mso-width-percent:0;mso-height-percent:0;mso-width-relative:margin;mso-height-relative:margin;v-text-anchor:top" o:gfxdata="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" filled="f" stroked="f">
                       <v:textbox inset="0,0,0,0">
                         <w:txbxContent>
                           <w:p>
@@ -7606,7 +7469,7 @@
                 </mc:Choice>
                 <mc:Fallback>
                   <w:pict>
-                    <v:shape w14:anchorId="1D5B5508" id="Text Box 13" o:spid="_x0000_s1042" type="#_x0000_t202" style="position:absolute;left:0;text-align:left;margin-left:16.6pt;margin-top:1.1pt;width:260.25pt;height:15.75pt;z-index:251720704;visibility:visible;mso-wrap-style:square;mso-width-percent:0;mso-height-percent:0;mso-wrap-distance-left:9pt;mso-wrap-distance-top:3.6pt;mso-wrap-distance-right:9pt;mso-wrap-distance-bottom:3.6pt;mso-position-horizontal:absolute;mso-position-horizontal-relative:text;mso-position-vertical:absolute;mso-position-vertical-relative:text;mso-width-percent:0;mso-height-percent:0;mso-width-relative:margin;mso-height-relative:margin;v-text-anchor:top" o:gfxdata="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" filled="f" stroked="f">
+                    <v:shape w14:anchorId="1D5B5508" id="Text Box 13" o:spid="_x0000_s1040" type="#_x0000_t202" style="position:absolute;left:0;text-align:left;margin-left:16.6pt;margin-top:1.1pt;width:260.25pt;height:15.75pt;z-index:251720704;visibility:visible;mso-wrap-style:square;mso-width-percent:0;mso-height-percent:0;mso-wrap-distance-left:9pt;mso-wrap-distance-top:3.6pt;mso-wrap-distance-right:9pt;mso-wrap-distance-bottom:3.6pt;mso-position-horizontal:absolute;mso-position-horizontal-relative:text;mso-position-vertical:absolute;mso-position-vertical-relative:text;mso-width-percent:0;mso-height-percent:0;mso-width-relative:margin;mso-height-relative:margin;v-text-anchor:top" o:gfxdata="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" filled="f" stroked="f">
                       <v:textbox inset="0,0,0,0">
                         <w:txbxContent>
                           <w:p>
@@ -7830,7 +7693,7 @@
                 </mc:Choice>
                 <mc:Fallback>
                   <w:pict>
-                    <v:shape w14:anchorId="68DEDCF0" id="Text Box 22" o:spid="_x0000_s1043" type="#_x0000_t202" style="position:absolute;left:0;text-align:left;margin-left:8.6pt;margin-top:8.6pt;width:204.75pt;height:17.25pt;z-index:251724800;visibility:visible;mso-wrap-style:square;mso-width-percent:0;mso-height-percent:0;mso-wrap-distance-left:9pt;mso-wrap-distance-top:3.6pt;mso-wrap-distance-right:9pt;mso-wrap-distance-bottom:3.6pt;mso-position-horizontal:absolute;mso-position-horizontal-relative:text;mso-position-vertical:absolute;mso-position-vertical-relative:page;mso-width-percent:0;mso-height-percent:0;mso-width-relative:margin;mso-height-relative:margin;v-text-anchor:top" o:gfxdata="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" filled="f" stroked="f">
+                    <v:shape w14:anchorId="68DEDCF0" id="Text Box 22" o:spid="_x0000_s1041" type="#_x0000_t202" style="position:absolute;left:0;text-align:left;margin-left:8.6pt;margin-top:8.6pt;width:204.75pt;height:17.25pt;z-index:251724800;visibility:visible;mso-wrap-style:square;mso-width-percent:0;mso-height-percent:0;mso-wrap-distance-left:9pt;mso-wrap-distance-top:3.6pt;mso-wrap-distance-right:9pt;mso-wrap-distance-bottom:3.6pt;mso-position-horizontal:absolute;mso-position-horizontal-relative:text;mso-position-vertical:absolute;mso-position-vertical-relative:page;mso-width-percent:0;mso-height-percent:0;mso-width-relative:margin;mso-height-relative:margin;v-text-anchor:top" o:gfxdata="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" filled="f" stroked="f">
                       <v:textbox inset="0,0,0,0">
                         <w:txbxContent>
                           <w:p>
@@ -8092,7 +7955,7 @@
                 </mc:Choice>
                 <mc:Fallback>
                   <w:pict>
-                    <v:shape w14:anchorId="42135ABA" id="Text Box 21" o:spid="_x0000_s1044" type="#_x0000_t202" style="position:absolute;left:0;text-align:left;margin-left:1.85pt;margin-top:25.4pt;width:204.75pt;height:28.5pt;z-index:251722752;visibility:visible;mso-wrap-style:square;mso-width-percent:0;mso-height-percent:0;mso-wrap-distance-left:9pt;mso-wrap-distance-top:3.6pt;mso-wrap-distance-right:9pt;mso-wrap-distance-bottom:3.6pt;mso-position-horizontal:absolute;mso-position-horizontal-relative:text;mso-position-vertical:absolute;mso-position-vertical-relative:page;mso-width-percent:0;mso-height-percent:0;mso-width-relative:margin;mso-height-relative:margin;v-text-anchor:top" o:gfxdata="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" filled="f" stroked="f">
+                    <v:shape w14:anchorId="42135ABA" id="Text Box 21" o:spid="_x0000_s1042" type="#_x0000_t202" style="position:absolute;left:0;text-align:left;margin-left:1.85pt;margin-top:25.4pt;width:204.75pt;height:28.5pt;z-index:251722752;visibility:visible;mso-wrap-style:square;mso-width-percent:0;mso-height-percent:0;mso-wrap-distance-left:9pt;mso-wrap-distance-top:3.6pt;mso-wrap-distance-right:9pt;mso-wrap-distance-bottom:3.6pt;mso-position-horizontal:absolute;mso-position-horizontal-relative:text;mso-position-vertical:absolute;mso-position-vertical-relative:page;mso-width-percent:0;mso-height-percent:0;mso-width-relative:margin;mso-height-relative:margin;v-text-anchor:top" o:gfxdata="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" filled="f" stroked="f">
                       <v:textbox inset="0,0,0,0">
                         <w:txbxContent>
                           <w:p>
@@ -8200,7 +8063,6 @@
                 <w:lang w:val="en-US"/>
               </w:rPr>
             </w:pPr>
-            <w:proofErr w:type="gramStart"/>
             <w:r>
               <w:rPr>
                 <w:rFonts w:ascii="Arial" w:hAnsi="Arial" w:cs="Arial"/>
@@ -8219,18 +8081,7 @@
                 <w:szCs w:val="20"/>
                 <w:lang w:val="en-US"/>
               </w:rPr>
-              <w:t>C  APPROVED</w:t>
-            </w:r>
-            <w:proofErr w:type="gramEnd"/>
-            <w:r>
-              <w:rPr>
-                <w:rFonts w:ascii="Arial" w:hAnsi="Arial" w:cs="Arial"/>
-                <w:i/>
-                <w:sz w:val="20"/>
-                <w:szCs w:val="20"/>
-                <w:lang w:val="en-US"/>
-              </w:rPr>
-              <w:t xml:space="preserve"> FOR:</w:t>
+              <w:t>C  APPROVED FOR:</w:t>
             </w:r>
           </w:p>
           <w:p>
@@ -8431,7 +8282,7 @@
                 </mc:Choice>
                 <mc:Fallback>
                   <w:pict>
-                    <v:shape w14:anchorId="55352A7D" id="Text Box 24" o:spid="_x0000_s1045" type="#_x0000_t202" style="position:absolute;margin-left:144.85pt;margin-top:25.75pt;width:228pt;height:31.5pt;z-index:251728896;visibility:visible;mso-wrap-style:square;mso-width-percent:0;mso-height-percent:0;mso-wrap-distance-left:9pt;mso-wrap-distance-top:3.6pt;mso-wrap-distance-right:9pt;mso-wrap-distance-bottom:3.6pt;mso-position-horizontal:absolute;mso-position-horizontal-relative:text;mso-position-vertical:absolute;mso-position-vertical-relative:text;mso-width-percent:0;mso-height-percent:0;mso-width-relative:margin;mso-height-relative:margin;v-text-anchor:top" o:gfxdata="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" filled="f" stroked="f">
+                    <v:shape w14:anchorId="55352A7D" id="Text Box 24" o:spid="_x0000_s1043" type="#_x0000_t202" style="position:absolute;margin-left:144.85pt;margin-top:25.75pt;width:228pt;height:31.5pt;z-index:251728896;visibility:visible;mso-wrap-style:square;mso-width-percent:0;mso-height-percent:0;mso-wrap-distance-left:9pt;mso-wrap-distance-top:3.6pt;mso-wrap-distance-right:9pt;mso-wrap-distance-bottom:3.6pt;mso-position-horizontal:absolute;mso-position-horizontal-relative:text;mso-position-vertical:absolute;mso-position-vertical-relative:text;mso-width-percent:0;mso-height-percent:0;mso-width-relative:margin;mso-height-relative:margin;v-text-anchor:top" o:gfxdata="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" filled="f" stroked="f">
                       <v:textbox inset="0,0,0,0">
                         <w:txbxContent>
                           <w:p>
@@ -8526,7 +8377,6 @@
                 <w:lang w:val="en-US"/>
               </w:rPr>
             </w:pPr>
-            <w:proofErr w:type="gramStart"/>
             <w:r>
               <w:rPr>
                 <w:rFonts w:ascii="Arial" w:hAnsi="Arial" w:cs="Arial"/>
@@ -8565,18 +8415,7 @@
                 <w:szCs w:val="20"/>
                 <w:lang w:val="en-US"/>
               </w:rPr>
-              <w:t>DISAPPROVED</w:t>
-            </w:r>
-            <w:proofErr w:type="gramEnd"/>
-            <w:r>
-              <w:rPr>
-                <w:rFonts w:ascii="Arial" w:hAnsi="Arial" w:cs="Arial"/>
-                <w:i/>
-                <w:sz w:val="20"/>
-                <w:szCs w:val="20"/>
-                <w:lang w:val="en-US"/>
-              </w:rPr>
-              <w:t xml:space="preserve"> DUE TO:</w:t>
+              <w:t>DISAPPROVED DUE TO:</w:t>
             </w:r>
           </w:p>
           <w:p>
@@ -8809,7 +8648,7 @@
                                     </w:rPr>
                                     <w:t xml:space="preserve">Acting </w:t>
                                   </w:r>
-                                  <w:bookmarkStart w:id="2" w:name="_Hlk166507935"/>
+                                  <w:bookmarkStart w:id="4" w:name="_Hlk166507935"/>
                                   <w:r>
                                     <w:rPr>
                                       <w:rFonts w:ascii="Cambria" w:hAnsi="Cambria"/>
@@ -8818,7 +8657,7 @@
                                     </w:rPr>
                                     <w:t>D</w:t>
                                   </w:r>
-                                  <w:bookmarkEnd w:id="2"/>
+                                  <w:bookmarkEnd w:id="4"/>
                                   <w:r>
                                     <w:rPr>
                                       <w:rFonts w:ascii="Cambria" w:hAnsi="Cambria"/>
@@ -8847,7 +8686,7 @@
                 </mc:Choice>
                 <mc:Fallback>
                   <w:pict>
-                    <v:shape w14:anchorId="22BE004E" id="Text Box 23" o:spid="_x0000_s1046" type="#_x0000_t202" style="position:absolute;left:0;text-align:left;margin-left:144.85pt;margin-top:2.1pt;width:228pt;height:31.5pt;z-index:251726848;visibility:visible;mso-wrap-style:square;mso-width-percent:0;mso-height-percent:0;mso-wrap-distance-left:9pt;mso-wrap-distance-top:3.6pt;mso-wrap-distance-right:9pt;mso-wrap-distance-bottom:3.6pt;mso-position-horizontal:absolute;mso-position-horizontal-relative:text;mso-position-vertical:absolute;mso-position-vertical-relative:text;mso-width-percent:0;mso-height-percent:0;mso-width-relative:margin;mso-height-relative:margin;v-text-anchor:top" o:gfxdata="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" filled="f" stroked="f">
+                    <v:shape w14:anchorId="22BE004E" id="Text Box 23" o:spid="_x0000_s1044" type="#_x0000_t202" style="position:absolute;left:0;text-align:left;margin-left:144.85pt;margin-top:2.1pt;width:228pt;height:31.5pt;z-index:251726848;visibility:visible;mso-wrap-style:square;mso-width-percent:0;mso-height-percent:0;mso-wrap-distance-left:9pt;mso-wrap-distance-top:3.6pt;mso-wrap-distance-right:9pt;mso-wrap-distance-bottom:3.6pt;mso-position-horizontal:absolute;mso-position-horizontal-relative:text;mso-position-vertical:absolute;mso-position-vertical-relative:text;mso-width-percent:0;mso-height-percent:0;mso-width-relative:margin;mso-height-relative:margin;v-text-anchor:top" o:gfxdata="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" filled="f" stroked="f">
                       <v:textbox inset="0,0,0,0">
                         <w:txbxContent>
                           <w:p>
@@ -9071,7 +8910,7 @@
           </mc:Choice>
           <mc:Fallback>
             <w:pict>
-              <v:shape w14:anchorId="1ED0F545" id="Text Box 60" o:spid="_x0000_s1047" type="#_x0000_t202" style="width:531pt;height:19.15pt;visibility:visible;mso-wrap-style:square;mso-left-percent:-10001;mso-top-percent:-10001;mso-position-horizontal:absolute;mso-position-horizontal-relative:char;mso-position-vertical:absolute;mso-position-vertical-relative:line;mso-left-percent:-10001;mso-top-percent:-10001;v-text-anchor:top" o:gfxdata="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" filled="f" strokeweight=".20894mm">
+              <v:shape w14:anchorId="1ED0F545" id="Text Box 60" o:spid="_x0000_s1045" type="#_x0000_t202" style="width:531pt;height:19.15pt;visibility:visible;mso-wrap-style:square;mso-left-percent:-10001;mso-top-percent:-10001;mso-position-horizontal:absolute;mso-position-horizontal-relative:char;mso-position-vertical:absolute;mso-position-vertical-relative:line;mso-left-percent:-10001;mso-top-percent:-10001;v-text-anchor:top" o:gfxdata="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" filled="f" strokeweight=".20894mm">
                 <v:textbox inset="0,0,0,0">
                   <w:txbxContent>
                     <w:p>
@@ -9997,7 +9836,6 @@
         </w:rPr>
         <w:t xml:space="preserve"> </w:t>
       </w:r>
-      <w:proofErr w:type="gramStart"/>
       <w:r>
         <w:rPr>
           <w:spacing w:val="-1"/>
@@ -10006,7 +9844,6 @@
         </w:rPr>
         <w:t>leave</w:t>
       </w:r>
-      <w:proofErr w:type="gramEnd"/>
       <w:r>
         <w:rPr>
           <w:spacing w:val="-3"/>
@@ -10995,7 +10832,6 @@
         </w:rPr>
         <w:t xml:space="preserve"> </w:t>
       </w:r>
-      <w:proofErr w:type="spellStart"/>
       <w:r>
         <w:rPr>
           <w:spacing w:val="-1"/>
@@ -11004,7 +10840,6 @@
         </w:rPr>
         <w:t>Availment</w:t>
       </w:r>
-      <w:proofErr w:type="spellEnd"/>
       <w:r>
         <w:rPr>
           <w:spacing w:val="21"/>
@@ -12481,7 +12316,6 @@
         </w:rPr>
         <w:t xml:space="preserve"> </w:t>
       </w:r>
-      <w:proofErr w:type="gramStart"/>
       <w:r>
         <w:rPr>
           <w:rFonts w:cs="Arial Narrow"/>
@@ -12517,7 +12351,6 @@
         </w:rPr>
         <w:t>doctor’s</w:t>
       </w:r>
-      <w:proofErr w:type="gramEnd"/>
       <w:r>
         <w:rPr>
           <w:rFonts w:cs="Arial Narrow"/>
@@ -12535,7 +12368,6 @@
         </w:rPr>
         <w:t xml:space="preserve"> </w:t>
       </w:r>
-      <w:proofErr w:type="gramStart"/>
       <w:r>
         <w:rPr>
           <w:rFonts w:cs="Arial Narrow"/>
@@ -12559,16 +12391,7 @@
           <w:w w:val="115"/>
           <w:sz w:val="16"/>
         </w:rPr>
-        <w:t>on</w:t>
-      </w:r>
-      <w:proofErr w:type="gramEnd"/>
-      <w:r>
-        <w:rPr>
-          <w:rFonts w:cs="Arial Narrow"/>
-          <w:w w:val="115"/>
-          <w:sz w:val="16"/>
-        </w:rPr>
-        <w:t xml:space="preserve"> </w:t>
+        <w:t xml:space="preserve">on </w:t>
       </w:r>
       <w:r>
         <w:rPr>
@@ -13722,23 +13545,13 @@
         </w:rPr>
         <w:t xml:space="preserve"> </w:t>
       </w:r>
-      <w:proofErr w:type="spellStart"/>
-      <w:r>
-        <w:rPr>
-          <w:spacing w:val="-1"/>
-          <w:w w:val="115"/>
-          <w:sz w:val="16"/>
-        </w:rPr>
-        <w:t>availment</w:t>
-      </w:r>
-      <w:proofErr w:type="spellEnd"/>
-      <w:r>
-        <w:rPr>
-          <w:spacing w:val="-1"/>
-          <w:w w:val="115"/>
-          <w:sz w:val="16"/>
-        </w:rPr>
-        <w:t>,</w:t>
+      <w:r>
+        <w:rPr>
+          <w:spacing w:val="-1"/>
+          <w:w w:val="115"/>
+          <w:sz w:val="16"/>
+        </w:rPr>
+        <w:t>availment,</w:t>
       </w:r>
       <w:r>
         <w:rPr>
@@ -13842,7 +13655,6 @@
         </w:rPr>
         <w:t xml:space="preserve"> </w:t>
       </w:r>
-      <w:proofErr w:type="gramStart"/>
       <w:r>
         <w:rPr>
           <w:spacing w:val="-1"/>
@@ -13851,7 +13663,6 @@
         </w:rPr>
         <w:t>leave</w:t>
       </w:r>
-      <w:proofErr w:type="gramEnd"/>
       <w:r>
         <w:rPr>
           <w:spacing w:val="15"/>
@@ -15308,7 +15119,6 @@
           <w:sz w:val="16"/>
         </w:rPr>
       </w:pPr>
-      <w:proofErr w:type="gramStart"/>
       <w:r>
         <w:rPr>
           <w:w w:val="115"/>
@@ -15329,15 +15139,7 @@
           <w:w w:val="115"/>
           <w:sz w:val="16"/>
         </w:rPr>
-        <w:t>shall</w:t>
-      </w:r>
-      <w:proofErr w:type="gramEnd"/>
-      <w:r>
-        <w:rPr>
-          <w:w w:val="115"/>
-          <w:sz w:val="16"/>
-        </w:rPr>
-        <w:t xml:space="preserve"> </w:t>
+        <w:t xml:space="preserve">shall </w:t>
       </w:r>
       <w:r>
         <w:rPr>
@@ -15347,7 +15149,6 @@
         </w:rPr>
         <w:t xml:space="preserve"> </w:t>
       </w:r>
-      <w:proofErr w:type="gramStart"/>
       <w:r>
         <w:rPr>
           <w:w w:val="115"/>
@@ -15368,15 +15169,7 @@
           <w:w w:val="115"/>
           <w:sz w:val="16"/>
         </w:rPr>
-        <w:t>filed</w:t>
-      </w:r>
-      <w:proofErr w:type="gramEnd"/>
-      <w:r>
-        <w:rPr>
-          <w:w w:val="115"/>
-          <w:sz w:val="16"/>
-        </w:rPr>
-        <w:t xml:space="preserve"> </w:t>
+        <w:t xml:space="preserve">filed </w:t>
       </w:r>
       <w:r>
         <w:rPr>
@@ -15386,7 +15179,6 @@
         </w:rPr>
         <w:t xml:space="preserve"> </w:t>
       </w:r>
-      <w:proofErr w:type="gramStart"/>
       <w:r>
         <w:rPr>
           <w:spacing w:val="-1"/>
@@ -15415,15 +15207,7 @@
           <w:w w:val="115"/>
           <w:sz w:val="16"/>
         </w:rPr>
-        <w:t>advance</w:t>
-      </w:r>
-      <w:proofErr w:type="gramEnd"/>
-      <w:r>
-        <w:rPr>
-          <w:w w:val="115"/>
-          <w:sz w:val="16"/>
-        </w:rPr>
-        <w:t xml:space="preserve"> </w:t>
+        <w:t xml:space="preserve">advance </w:t>
       </w:r>
       <w:r>
         <w:rPr>
@@ -15433,7 +15217,6 @@
         </w:rPr>
         <w:t xml:space="preserve"> </w:t>
       </w:r>
-      <w:proofErr w:type="gramStart"/>
       <w:r>
         <w:rPr>
           <w:w w:val="115"/>
@@ -15457,7 +15240,6 @@
         </w:rPr>
         <w:t>immediately</w:t>
       </w:r>
-      <w:proofErr w:type="gramEnd"/>
       <w:r>
         <w:rPr>
           <w:w w:val="115"/>
@@ -15473,7 +15255,6 @@
         </w:rPr>
         <w:t xml:space="preserve"> </w:t>
       </w:r>
-      <w:proofErr w:type="gramStart"/>
       <w:r>
         <w:rPr>
           <w:w w:val="115"/>
@@ -15494,15 +15275,7 @@
           <w:w w:val="115"/>
           <w:sz w:val="16"/>
         </w:rPr>
-        <w:t>the</w:t>
-      </w:r>
-      <w:proofErr w:type="gramEnd"/>
-      <w:r>
-        <w:rPr>
-          <w:w w:val="115"/>
-          <w:sz w:val="16"/>
-        </w:rPr>
-        <w:t xml:space="preserve"> </w:t>
+        <w:t xml:space="preserve">the </w:t>
       </w:r>
       <w:r>
         <w:rPr>
@@ -16382,18 +16155,8 @@
           <w:w w:val="115"/>
           <w:sz w:val="16"/>
         </w:rPr>
-        <w:t>Barangay/</w:t>
-      </w:r>
-      <w:proofErr w:type="spellStart"/>
-      <w:r>
-        <w:rPr>
-          <w:spacing w:val="-1"/>
-          <w:w w:val="115"/>
-          <w:sz w:val="16"/>
-        </w:rPr>
-        <w:t>Kagawad</w:t>
-      </w:r>
-      <w:proofErr w:type="spellEnd"/>
+        <w:t>Barangay/Kagawad</w:t>
+      </w:r>
       <w:r>
         <w:rPr>
           <w:spacing w:val="17"/>
@@ -17697,7 +17460,7 @@
           </mc:Choice>
           <mc:Fallback>
             <w:pict>
-              <v:shape w14:anchorId="0B91A5BA" id="_x0000_s1048" type="#_x0000_t202" style="position:absolute;left:0;text-align:left;margin-left:0;margin-top:781.5pt;width:522.75pt;height:45.55pt;z-index:251713536;visibility:visible;mso-wrap-style:square;mso-width-percent:0;mso-height-percent:200;mso-wrap-distance-left:9pt;mso-wrap-distance-top:3.6pt;mso-wrap-distance-right:9pt;mso-wrap-distance-bottom:3.6pt;mso-position-horizontal:left;mso-position-horizontal-relative:margin;mso-position-vertical:absolute;mso-position-vertical-relative:page;mso-width-percent:0;mso-height-percent:200;mso-width-relative:margin;mso-height-relative:margin;v-text-anchor:top" o:gfxdata="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" filled="f" stroked="f">
+              <v:shape w14:anchorId="0B91A5BA" id="_x0000_s1046" type="#_x0000_t202" style="position:absolute;left:0;text-align:left;margin-left:0;margin-top:781.5pt;width:522.75pt;height:45.55pt;z-index:251713536;visibility:visible;mso-wrap-style:square;mso-width-percent:0;mso-height-percent:200;mso-wrap-distance-left:9pt;mso-wrap-distance-top:3.6pt;mso-wrap-distance-right:9pt;mso-wrap-distance-bottom:3.6pt;mso-position-horizontal:left;mso-position-horizontal-relative:margin;mso-position-vertical:absolute;mso-position-vertical-relative:page;mso-width-percent:0;mso-height-percent:200;mso-width-relative:margin;mso-height-relative:margin;v-text-anchor:top" o:gfxdata="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" filled="f" stroked="f">
                 <v:textbox style="mso-fit-shape-to-text:t">
                   <w:txbxContent>
                     <w:p>

</xml_diff>